<commit_message>
changement pdf E6 nextcloud
</commit_message>
<xml_diff>
--- a/docs/Annexes 7-1a - Épreuve E6 - BTS SIO.docx
+++ b/docs/Annexes 7-1a - Épreuve E6 - BTS SIO.docx
@@ -1,18 +1,18 @@
 
 <file path=word/document.xml><?xml version="1.0" encoding="utf-8"?>
-<w:document xmlns:o="urn:schemas-microsoft-com:office:office" xmlns:r="http://schemas.openxmlformats.org/officeDocument/2006/relationships" xmlns:v="urn:schemas-microsoft-com:vml" xmlns:w="http://schemas.openxmlformats.org/wordprocessingml/2006/main" xmlns:w10="urn:schemas-microsoft-com:office:word" xmlns:wp="http://schemas.openxmlformats.org/drawingml/2006/wordprocessingDrawing" xmlns:pic="http://schemas.openxmlformats.org/drawingml/2006/picture" xmlns:wps="http://schemas.microsoft.com/office/word/2010/wordprocessingShape" xmlns:wpg="http://schemas.microsoft.com/office/word/2010/wordprocessingGroup" xmlns:mc="http://schemas.openxmlformats.org/markup-compatibility/2006" xmlns:wp14="http://schemas.microsoft.com/office/word/2010/wordprocessingDrawing" xmlns:w14="http://schemas.microsoft.com/office/word/2010/wordml" xmlns:w15="http://schemas.microsoft.com/office/word/2012/wordml" mc:Ignorable="w14 wp14 w15">
+<w:document xmlns:o="urn:schemas-microsoft-com:office:office" xmlns:r="http://schemas.openxmlformats.org/officeDocument/2006/relationships" xmlns:v="urn:schemas-microsoft-com:vml" xmlns:w="http://schemas.openxmlformats.org/wordprocessingml/2006/main" xmlns:w10="urn:schemas-microsoft-com:office:word" xmlns:wp="http://schemas.openxmlformats.org/drawingml/2006/wordprocessingDrawing" xmlns:wps="http://schemas.microsoft.com/office/word/2010/wordprocessingShape" xmlns:wpg="http://schemas.microsoft.com/office/word/2010/wordprocessingGroup" xmlns:mc="http://schemas.openxmlformats.org/markup-compatibility/2006" xmlns:wp14="http://schemas.microsoft.com/office/word/2010/wordprocessingDrawing" xmlns:w14="http://schemas.microsoft.com/office/word/2010/wordml" xmlns:w15="http://schemas.microsoft.com/office/word/2012/wordml" mc:Ignorable="w14 wp14 w15">
   <w:body>
     <w:tbl>
       <w:tblPr>
         <w:tblW w:w="9923" w:type="dxa"/>
-        <w:jc w:val="start"/>
+        <w:jc w:val="left"/>
         <w:tblInd w:w="-147" w:type="dxa"/>
         <w:tblLayout w:type="fixed"/>
         <w:tblCellMar>
           <w:top w:w="0" w:type="dxa"/>
-          <w:start w:w="108" w:type="dxa"/>
+          <w:left w:w="108" w:type="dxa"/>
           <w:bottom w:w="0" w:type="dxa"/>
-          <w:end w:w="108" w:type="dxa"/>
+          <w:right w:w="108" w:type="dxa"/>
         </w:tblCellMar>
         <w:tblLook w:val="04a0" w:noHBand="0" w:noVBand="1" w:firstColumn="1" w:lastRow="0" w:lastColumn="0" w:firstRow="1"/>
       </w:tblPr>
@@ -26,9 +26,9 @@
             <w:tcW w:w="9923" w:type="dxa"/>
             <w:tcBorders>
               <w:top w:val="single" w:sz="4" w:space="0" w:color="000000"/>
-              <w:start w:val="single" w:sz="4" w:space="0" w:color="000000"/>
+              <w:left w:val="single" w:sz="4" w:space="0" w:color="000000"/>
               <w:bottom w:val="single" w:sz="4" w:space="0" w:color="000000"/>
-              <w:end w:val="single" w:sz="4" w:space="0" w:color="000000"/>
+              <w:right w:val="single" w:sz="4" w:space="0" w:color="000000"/>
             </w:tcBorders>
           </w:tcPr>
           <w:p>
@@ -88,7 +88,7 @@
                 <w:numId w:val="0"/>
               </w:numPr>
               <w:spacing w:before="120" w:after="120"/>
-              <w:ind w:hanging="0" w:start="0"/>
+              <w:ind w:hanging="0" w:left="0"/>
               <w:jc w:val="center"/>
               <w:outlineLvl w:val="0"/>
               <w:rPr>
@@ -184,7 +184,7 @@
           <w:ilvl w:val="0"/>
           <w:numId w:val="0"/>
         </w:numPr>
-        <w:ind w:hanging="0" w:start="0"/>
+        <w:ind w:hanging="0" w:left="0"/>
         <w:outlineLvl w:val="0"/>
         <w:rPr>
           <w:rFonts w:ascii="Arial" w:hAnsi="Arial" w:cs="Arial"/>
@@ -207,21 +207,21 @@
     <w:tbl>
       <w:tblPr>
         <w:tblW w:w="9923" w:type="dxa"/>
-        <w:jc w:val="start"/>
+        <w:jc w:val="left"/>
         <w:tblInd w:w="-147" w:type="dxa"/>
         <w:tblLayout w:type="fixed"/>
         <w:tblCellMar>
           <w:top w:w="0" w:type="dxa"/>
-          <w:start w:w="5" w:type="dxa"/>
+          <w:left w:w="5" w:type="dxa"/>
           <w:bottom w:w="0" w:type="dxa"/>
-          <w:end w:w="5" w:type="dxa"/>
+          <w:right w:w="5" w:type="dxa"/>
         </w:tblCellMar>
         <w:tblLook w:val="0000" w:noHBand="0" w:noVBand="0" w:firstColumn="0" w:lastRow="0" w:lastColumn="0" w:firstRow="0"/>
       </w:tblPr>
       <w:tblGrid>
-        <w:gridCol w:w="3117"/>
+        <w:gridCol w:w="3116"/>
         <w:gridCol w:w="4111"/>
-        <w:gridCol w:w="711"/>
+        <w:gridCol w:w="712"/>
         <w:gridCol w:w="1984"/>
       </w:tblGrid>
       <w:tr>
@@ -235,9 +235,9 @@
             <w:gridSpan w:val="3"/>
             <w:tcBorders>
               <w:top w:val="single" w:sz="4" w:space="0" w:color="000000"/>
-              <w:start w:val="single" w:sz="4" w:space="0" w:color="000000"/>
+              <w:left w:val="single" w:sz="4" w:space="0" w:color="000000"/>
               <w:bottom w:val="single" w:sz="4" w:space="0" w:color="000000"/>
-              <w:end w:val="single" w:sz="4" w:space="0" w:color="000000"/>
+              <w:right w:val="single" w:sz="4" w:space="0" w:color="000000"/>
             </w:tcBorders>
             <w:vAlign w:val="center"/>
           </w:tcPr>
@@ -267,9 +267,9 @@
             <w:tcW w:w="1984" w:type="dxa"/>
             <w:tcBorders>
               <w:top w:val="single" w:sz="4" w:space="0" w:color="000000"/>
-              <w:start w:val="single" w:sz="4" w:space="0" w:color="000000"/>
+              <w:left w:val="single" w:sz="4" w:space="0" w:color="000000"/>
               <w:bottom w:val="single" w:sz="4" w:space="0" w:color="000000"/>
-              <w:end w:val="single" w:sz="4" w:space="0" w:color="000000"/>
+              <w:right w:val="single" w:sz="4" w:space="0" w:color="000000"/>
             </w:tcBorders>
             <w:vAlign w:val="center"/>
           </w:tcPr>
@@ -306,12 +306,12 @@
         </w:trPr>
         <w:tc>
           <w:tcPr>
-            <w:tcW w:w="7228" w:type="dxa"/>
+            <w:tcW w:w="7227" w:type="dxa"/>
             <w:gridSpan w:val="2"/>
             <w:tcBorders>
               <w:top w:val="single" w:sz="4" w:space="0" w:color="000000"/>
-              <w:start w:val="single" w:sz="4" w:space="0" w:color="000000"/>
-              <w:end w:val="single" w:sz="4" w:space="0" w:color="000000"/>
+              <w:left w:val="single" w:sz="4" w:space="0" w:color="000000"/>
+              <w:right w:val="single" w:sz="4" w:space="0" w:color="000000"/>
             </w:tcBorders>
           </w:tcPr>
           <w:p>
@@ -337,12 +337,12 @@
         </w:tc>
         <w:tc>
           <w:tcPr>
-            <w:tcW w:w="2695" w:type="dxa"/>
+            <w:tcW w:w="2696" w:type="dxa"/>
             <w:gridSpan w:val="2"/>
             <w:tcBorders>
               <w:top w:val="single" w:sz="4" w:space="0" w:color="000000"/>
-              <w:start w:val="single" w:sz="4" w:space="0" w:color="000000"/>
-              <w:end w:val="single" w:sz="4" w:space="0" w:color="000000"/>
+              <w:left w:val="single" w:sz="4" w:space="0" w:color="000000"/>
+              <w:right w:val="single" w:sz="4" w:space="0" w:color="000000"/>
             </w:tcBorders>
           </w:tcPr>
           <w:p>
@@ -375,10 +375,10 @@
         </w:trPr>
         <w:tc>
           <w:tcPr>
-            <w:tcW w:w="3117" w:type="dxa"/>
+            <w:tcW w:w="3116" w:type="dxa"/>
             <w:tcBorders>
               <w:top w:val="single" w:sz="4" w:space="0" w:color="000000"/>
-              <w:start w:val="single" w:sz="4" w:space="0" w:color="000000"/>
+              <w:left w:val="single" w:sz="4" w:space="0" w:color="000000"/>
               <w:bottom w:val="single" w:sz="4" w:space="0" w:color="000000"/>
             </w:tcBorders>
             <w:vAlign w:val="center"/>
@@ -424,19 +424,19 @@
             </w:r>
             <w:r>
               <w:rPr>
-                <w:rFonts w:ascii="Arial" w:hAnsi="Arial"/>
-                <w:b/>
-                <w:sz w:val="20"/>
+                <w:sz w:val="20"/>
+                <w:b/>
                 <w:szCs w:val="21"/>
+                <w:rFonts w:ascii="Arial" w:hAnsi="Arial"/>
               </w:rPr>
               <w:instrText xml:space="preserve"> FORMCHECKBOX </w:instrText>
             </w:r>
             <w:r>
               <w:rPr>
-                <w:rFonts w:ascii="Arial" w:hAnsi="Arial"/>
-                <w:b/>
-                <w:sz w:val="20"/>
+                <w:sz w:val="20"/>
+                <w:b/>
                 <w:szCs w:val="21"/>
+                <w:rFonts w:ascii="Arial" w:hAnsi="Arial"/>
               </w:rPr>
               <w:fldChar w:fldCharType="separate"/>
             </w:r>
@@ -446,10 +446,10 @@
             <w:r/>
             <w:r>
               <w:rPr>
-                <w:rFonts w:ascii="Arial" w:hAnsi="Arial"/>
-                <w:b/>
-                <w:sz w:val="20"/>
+                <w:sz w:val="20"/>
+                <w:b/>
                 <w:szCs w:val="21"/>
+                <w:rFonts w:ascii="Arial" w:hAnsi="Arial"/>
               </w:rPr>
               <w:fldChar w:fldCharType="end"/>
             </w:r>
@@ -469,7 +469,7 @@
             <w:tcBorders>
               <w:top w:val="single" w:sz="4" w:space="0" w:color="000000"/>
               <w:bottom w:val="single" w:sz="4" w:space="0" w:color="000000"/>
-              <w:end w:val="single" w:sz="4" w:space="0" w:color="000000"/>
+              <w:right w:val="single" w:sz="4" w:space="0" w:color="000000"/>
             </w:tcBorders>
             <w:vAlign w:val="center"/>
           </w:tcPr>
@@ -514,19 +514,19 @@
             </w:r>
             <w:r>
               <w:rPr>
-                <w:rFonts w:ascii="Arial" w:hAnsi="Arial"/>
-                <w:b/>
-                <w:sz w:val="20"/>
+                <w:sz w:val="20"/>
+                <w:b/>
                 <w:szCs w:val="21"/>
+                <w:rFonts w:ascii="Arial" w:hAnsi="Arial"/>
               </w:rPr>
               <w:instrText xml:space="preserve"> FORMCHECKBOX </w:instrText>
             </w:r>
             <w:r>
               <w:rPr>
-                <w:rFonts w:ascii="Arial" w:hAnsi="Arial"/>
-                <w:b/>
-                <w:sz w:val="20"/>
+                <w:sz w:val="20"/>
+                <w:b/>
                 <w:szCs w:val="21"/>
+                <w:rFonts w:ascii="Arial" w:hAnsi="Arial"/>
               </w:rPr>
               <w:fldChar w:fldCharType="separate"/>
             </w:r>
@@ -536,10 +536,10 @@
             <w:r/>
             <w:r>
               <w:rPr>
-                <w:rFonts w:ascii="Arial" w:hAnsi="Arial"/>
-                <w:b/>
-                <w:sz w:val="20"/>
+                <w:sz w:val="20"/>
+                <w:b/>
                 <w:szCs w:val="21"/>
+                <w:rFonts w:ascii="Arial" w:hAnsi="Arial"/>
               </w:rPr>
               <w:fldChar w:fldCharType="end"/>
             </w:r>
@@ -555,12 +555,12 @@
         </w:tc>
         <w:tc>
           <w:tcPr>
-            <w:tcW w:w="2695" w:type="dxa"/>
+            <w:tcW w:w="2696" w:type="dxa"/>
             <w:gridSpan w:val="2"/>
             <w:tcBorders>
               <w:top w:val="single" w:sz="4" w:space="0" w:color="000000"/>
               <w:bottom w:val="single" w:sz="4" w:space="0" w:color="000000"/>
-              <w:end w:val="single" w:sz="4" w:space="0" w:color="000000"/>
+              <w:right w:val="single" w:sz="4" w:space="0" w:color="000000"/>
             </w:tcBorders>
             <w:vAlign w:val="center"/>
           </w:tcPr>
@@ -608,9 +608,9 @@
             <w:gridSpan w:val="4"/>
             <w:tcBorders>
               <w:top w:val="single" w:sz="4" w:space="0" w:color="000000"/>
-              <w:start w:val="single" w:sz="4" w:space="0" w:color="000000"/>
+              <w:left w:val="single" w:sz="4" w:space="0" w:color="000000"/>
               <w:bottom w:val="single" w:sz="4" w:space="0" w:color="000000"/>
-              <w:end w:val="single" w:sz="4" w:space="0" w:color="000000"/>
+              <w:right w:val="single" w:sz="4" w:space="0" w:color="000000"/>
             </w:tcBorders>
           </w:tcPr>
           <w:p>
@@ -665,9 +665,9 @@
             <w:gridSpan w:val="4"/>
             <w:tcBorders>
               <w:top w:val="single" w:sz="4" w:space="0" w:color="000000"/>
-              <w:start w:val="single" w:sz="4" w:space="0" w:color="000000"/>
+              <w:left w:val="single" w:sz="4" w:space="0" w:color="000000"/>
               <w:bottom w:val="single" w:sz="4" w:space="0" w:color="000000"/>
-              <w:end w:val="single" w:sz="4" w:space="0" w:color="000000"/>
+              <w:right w:val="single" w:sz="4" w:space="0" w:color="000000"/>
             </w:tcBorders>
           </w:tcPr>
           <w:p>
@@ -722,9 +722,9 @@
             <w:gridSpan w:val="4"/>
             <w:tcBorders>
               <w:top w:val="single" w:sz="4" w:space="0" w:color="000000"/>
-              <w:start w:val="single" w:sz="4" w:space="0" w:color="000000"/>
+              <w:left w:val="single" w:sz="4" w:space="0" w:color="000000"/>
               <w:bottom w:val="single" w:sz="4" w:space="0" w:color="000000"/>
-              <w:end w:val="single" w:sz="4" w:space="0" w:color="000000"/>
+              <w:right w:val="single" w:sz="4" w:space="0" w:color="000000"/>
             </w:tcBorders>
           </w:tcPr>
           <w:p>
@@ -817,16 +817,16 @@
             </w:r>
             <w:r>
               <w:rPr>
-                <w:b/>
-                <w:sz w:val="20"/>
+                <w:sz w:val="20"/>
+                <w:b/>
                 <w:szCs w:val="24"/>
               </w:rPr>
               <w:instrText xml:space="preserve"> FORMCHECKBOX </w:instrText>
             </w:r>
             <w:r>
               <w:rPr>
-                <w:b/>
-                <w:sz w:val="20"/>
+                <w:sz w:val="20"/>
+                <w:b/>
                 <w:szCs w:val="24"/>
               </w:rPr>
               <w:fldChar w:fldCharType="separate"/>
@@ -843,14 +843,16 @@
             </w:r>
             <w:r>
               <w:rPr>
-                <w:b/>
-                <w:sz w:val="20"/>
+                <w:sz w:val="20"/>
+                <w:b/>
                 <w:szCs w:val="24"/>
               </w:rPr>
               <w:fldChar w:fldCharType="end"/>
             </w:r>
-            <w:bookmarkStart w:id="6" w:name="CheckBox_Copy_1"/>
+            <w:bookmarkStart w:id="6" w:name="CheckBox_Copy_1_Copie_1"/>
+            <w:bookmarkStart w:id="7" w:name="CheckBox_Copy_1"/>
             <w:bookmarkEnd w:id="6"/>
+            <w:bookmarkEnd w:id="7"/>
             <w:r>
               <w:rPr>
                 <w:b/>
@@ -859,7 +861,7 @@
               </w:rPr>
               <w:t xml:space="preserve">  Seul</w:t>
             </w:r>
-            <w:bookmarkStart w:id="7" w:name="CheckBox_Copy_3"/>
+            <w:bookmarkStart w:id="8" w:name="CheckBox_Copy_3"/>
             <w:r>
               <w:rPr>
                 <w:b/>
@@ -884,23 +886,23 @@
             </w:r>
             <w:r>
               <w:rPr>
-                <w:b/>
-                <w:sz w:val="20"/>
+                <w:sz w:val="20"/>
+                <w:b/>
                 <w:szCs w:val="24"/>
               </w:rPr>
               <w:instrText xml:space="preserve"> FORMCHECKBOX </w:instrText>
             </w:r>
             <w:r>
               <w:rPr>
-                <w:b/>
-                <w:sz w:val="20"/>
+                <w:sz w:val="20"/>
+                <w:b/>
                 <w:szCs w:val="24"/>
               </w:rPr>
               <w:fldChar w:fldCharType="separate"/>
             </w:r>
-            <w:bookmarkStart w:id="8" w:name="CheckBox_Copy_2"/>
             <w:bookmarkStart w:id="9" w:name="CheckBox_Copy_2"/>
-            <w:bookmarkEnd w:id="9"/>
+            <w:bookmarkStart w:id="10" w:name="CheckBox_Copy_2"/>
+            <w:bookmarkEnd w:id="10"/>
             <w:r>
               <w:rPr>
                 <w:b/>
@@ -910,15 +912,17 @@
             </w:r>
             <w:r>
               <w:rPr>
-                <w:b/>
-                <w:sz w:val="20"/>
+                <w:sz w:val="20"/>
+                <w:b/>
                 <w:szCs w:val="24"/>
               </w:rPr>
               <w:fldChar w:fldCharType="end"/>
             </w:r>
-            <w:bookmarkStart w:id="10" w:name="CheckBox_Copy_2"/>
-            <w:bookmarkEnd w:id="7"/>
-            <w:bookmarkEnd w:id="10"/>
+            <w:bookmarkStart w:id="11" w:name="CheckBox_Copy_2_Copie_1"/>
+            <w:bookmarkStart w:id="12" w:name="CheckBox_Copy_2"/>
+            <w:bookmarkEnd w:id="8"/>
+            <w:bookmarkEnd w:id="11"/>
+            <w:bookmarkEnd w:id="12"/>
             <w:r>
               <w:rPr>
                 <w:b/>
@@ -941,9 +945,9 @@
             <w:gridSpan w:val="4"/>
             <w:tcBorders>
               <w:top w:val="single" w:sz="4" w:space="0" w:color="000000"/>
-              <w:start w:val="single" w:sz="4" w:space="0" w:color="000000"/>
+              <w:left w:val="single" w:sz="4" w:space="0" w:color="000000"/>
               <w:bottom w:val="single" w:sz="4" w:space="0" w:color="000000"/>
-              <w:end w:val="single" w:sz="4" w:space="0" w:color="000000"/>
+              <w:right w:val="single" w:sz="4" w:space="0" w:color="000000"/>
             </w:tcBorders>
           </w:tcPr>
           <w:p>
@@ -1004,40 +1008,42 @@
             </w:r>
             <w:r>
               <w:rPr>
-                <w:rFonts w:cs="Arial" w:ascii="Arial" w:hAnsi="Arial"/>
-                <w:b/>
-                <w:sz w:val="20"/>
+                <w:sz w:val="20"/>
+                <w:b/>
+                <w:rFonts w:cs="Arial" w:ascii="Arial" w:hAnsi="Arial"/>
               </w:rPr>
               <w:instrText xml:space="preserve"> FORMCHECKBOX </w:instrText>
             </w:r>
             <w:r>
               <w:rPr>
-                <w:rFonts w:cs="Arial" w:ascii="Arial" w:hAnsi="Arial"/>
-                <w:b/>
-                <w:sz w:val="20"/>
+                <w:sz w:val="20"/>
+                <w:b/>
+                <w:rFonts w:cs="Arial" w:ascii="Arial" w:hAnsi="Arial"/>
               </w:rPr>
               <w:fldChar w:fldCharType="separate"/>
             </w:r>
-            <w:bookmarkStart w:id="11" w:name="CheckBox_Copy_4"/>
-            <w:bookmarkStart w:id="12" w:name="CheckBox_Copy_4"/>
-            <w:bookmarkEnd w:id="12"/>
-            <w:r>
-              <w:rPr>
-                <w:rFonts w:cs="Arial" w:ascii="Arial" w:hAnsi="Arial"/>
-                <w:b/>
-                <w:sz w:val="20"/>
-              </w:rPr>
-            </w:r>
-            <w:r>
-              <w:rPr>
-                <w:rFonts w:cs="Arial" w:ascii="Arial" w:hAnsi="Arial"/>
-                <w:b/>
-                <w:sz w:val="20"/>
+            <w:bookmarkStart w:id="13" w:name="CheckBox_Copy_4"/>
+            <w:bookmarkStart w:id="14" w:name="CheckBox_Copy_4"/>
+            <w:bookmarkEnd w:id="14"/>
+            <w:r>
+              <w:rPr>
+                <w:rFonts w:cs="Arial" w:ascii="Arial" w:hAnsi="Arial"/>
+                <w:b/>
+                <w:sz w:val="20"/>
+              </w:rPr>
+            </w:r>
+            <w:r>
+              <w:rPr>
+                <w:sz w:val="20"/>
+                <w:b/>
+                <w:rFonts w:cs="Arial" w:ascii="Arial" w:hAnsi="Arial"/>
               </w:rPr>
               <w:fldChar w:fldCharType="end"/>
             </w:r>
-            <w:bookmarkStart w:id="13" w:name="CheckBox_Copy_4"/>
-            <w:bookmarkEnd w:id="13"/>
+            <w:bookmarkStart w:id="15" w:name="CheckBox_Copy_4_Copie_1"/>
+            <w:bookmarkStart w:id="16" w:name="CheckBox_Copy_4"/>
+            <w:bookmarkEnd w:id="15"/>
+            <w:bookmarkEnd w:id="16"/>
             <w:r>
               <w:rPr>
                 <w:rFonts w:cs="Arial" w:ascii="Arial" w:hAnsi="Arial"/>
@@ -1090,40 +1096,42 @@
             </w:r>
             <w:r>
               <w:rPr>
-                <w:rFonts w:cs="Arial" w:ascii="Arial" w:hAnsi="Arial"/>
-                <w:b/>
-                <w:sz w:val="20"/>
+                <w:sz w:val="20"/>
+                <w:b/>
+                <w:rFonts w:cs="Arial" w:ascii="Arial" w:hAnsi="Arial"/>
               </w:rPr>
               <w:instrText xml:space="preserve"> FORMCHECKBOX </w:instrText>
             </w:r>
             <w:r>
               <w:rPr>
-                <w:rFonts w:cs="Arial" w:ascii="Arial" w:hAnsi="Arial"/>
-                <w:b/>
-                <w:sz w:val="20"/>
+                <w:sz w:val="20"/>
+                <w:b/>
+                <w:rFonts w:cs="Arial" w:ascii="Arial" w:hAnsi="Arial"/>
               </w:rPr>
               <w:fldChar w:fldCharType="separate"/>
             </w:r>
-            <w:bookmarkStart w:id="14" w:name="CheckBox_Copy_5"/>
-            <w:bookmarkStart w:id="15" w:name="CheckBox_Copy_5"/>
-            <w:bookmarkEnd w:id="15"/>
-            <w:r>
-              <w:rPr>
-                <w:rFonts w:cs="Arial" w:ascii="Arial" w:hAnsi="Arial"/>
-                <w:b/>
-                <w:sz w:val="20"/>
-              </w:rPr>
-            </w:r>
-            <w:r>
-              <w:rPr>
-                <w:rFonts w:cs="Arial" w:ascii="Arial" w:hAnsi="Arial"/>
-                <w:b/>
-                <w:sz w:val="20"/>
+            <w:bookmarkStart w:id="17" w:name="CheckBox_Copy_5"/>
+            <w:bookmarkStart w:id="18" w:name="CheckBox_Copy_5"/>
+            <w:bookmarkEnd w:id="18"/>
+            <w:r>
+              <w:rPr>
+                <w:rFonts w:cs="Arial" w:ascii="Arial" w:hAnsi="Arial"/>
+                <w:b/>
+                <w:sz w:val="20"/>
+              </w:rPr>
+            </w:r>
+            <w:r>
+              <w:rPr>
+                <w:sz w:val="20"/>
+                <w:b/>
+                <w:rFonts w:cs="Arial" w:ascii="Arial" w:hAnsi="Arial"/>
               </w:rPr>
               <w:fldChar w:fldCharType="end"/>
             </w:r>
-            <w:bookmarkStart w:id="16" w:name="CheckBox_Copy_5"/>
-            <w:bookmarkEnd w:id="16"/>
+            <w:bookmarkStart w:id="19" w:name="CheckBox_Copy_5_Copie_1"/>
+            <w:bookmarkStart w:id="20" w:name="CheckBox_Copy_5"/>
+            <w:bookmarkEnd w:id="19"/>
+            <w:bookmarkEnd w:id="20"/>
             <w:r>
               <w:rPr>
                 <w:rFonts w:cs="Arial" w:ascii="Arial" w:hAnsi="Arial"/>
@@ -1174,40 +1182,42 @@
             </w:r>
             <w:r>
               <w:rPr>
-                <w:rFonts w:cs="Arial" w:ascii="Arial" w:hAnsi="Arial"/>
-                <w:b/>
-                <w:sz w:val="20"/>
+                <w:sz w:val="20"/>
+                <w:b/>
+                <w:rFonts w:cs="Arial" w:ascii="Arial" w:hAnsi="Arial"/>
               </w:rPr>
               <w:instrText xml:space="preserve"> FORMCHECKBOX </w:instrText>
             </w:r>
             <w:r>
               <w:rPr>
-                <w:rFonts w:cs="Arial" w:ascii="Arial" w:hAnsi="Arial"/>
-                <w:b/>
-                <w:sz w:val="20"/>
+                <w:sz w:val="20"/>
+                <w:b/>
+                <w:rFonts w:cs="Arial" w:ascii="Arial" w:hAnsi="Arial"/>
               </w:rPr>
               <w:fldChar w:fldCharType="separate"/>
             </w:r>
-            <w:bookmarkStart w:id="17" w:name="CheckBox_Copy_6"/>
-            <w:bookmarkStart w:id="18" w:name="CheckBox_Copy_6"/>
-            <w:bookmarkEnd w:id="18"/>
-            <w:r>
-              <w:rPr>
-                <w:rFonts w:cs="Arial" w:ascii="Arial" w:hAnsi="Arial"/>
-                <w:b/>
-                <w:sz w:val="20"/>
-              </w:rPr>
-            </w:r>
-            <w:r>
-              <w:rPr>
-                <w:rFonts w:cs="Arial" w:ascii="Arial" w:hAnsi="Arial"/>
-                <w:b/>
-                <w:sz w:val="20"/>
+            <w:bookmarkStart w:id="21" w:name="CheckBox_Copy_6"/>
+            <w:bookmarkStart w:id="22" w:name="CheckBox_Copy_6"/>
+            <w:bookmarkEnd w:id="22"/>
+            <w:r>
+              <w:rPr>
+                <w:rFonts w:cs="Arial" w:ascii="Arial" w:hAnsi="Arial"/>
+                <w:b/>
+                <w:sz w:val="20"/>
+              </w:rPr>
+            </w:r>
+            <w:r>
+              <w:rPr>
+                <w:sz w:val="20"/>
+                <w:b/>
+                <w:rFonts w:cs="Arial" w:ascii="Arial" w:hAnsi="Arial"/>
               </w:rPr>
               <w:fldChar w:fldCharType="end"/>
             </w:r>
-            <w:bookmarkStart w:id="19" w:name="CheckBox_Copy_6"/>
-            <w:bookmarkEnd w:id="19"/>
+            <w:bookmarkStart w:id="23" w:name="CheckBox_Copy_6_Copie_1"/>
+            <w:bookmarkStart w:id="24" w:name="CheckBox_Copy_6"/>
+            <w:bookmarkEnd w:id="23"/>
+            <w:bookmarkEnd w:id="24"/>
             <w:r>
               <w:rPr>
                 <w:rFonts w:cs="Arial" w:ascii="Arial" w:hAnsi="Arial"/>
@@ -1237,9 +1247,9 @@
             <w:gridSpan w:val="4"/>
             <w:tcBorders>
               <w:top w:val="single" w:sz="4" w:space="0" w:color="000000"/>
-              <w:start w:val="single" w:sz="4" w:space="0" w:color="000000"/>
+              <w:left w:val="single" w:sz="4" w:space="0" w:color="000000"/>
               <w:bottom w:val="single" w:sz="4" w:space="0" w:color="000000"/>
-              <w:end w:val="single" w:sz="4" w:space="0" w:color="000000"/>
+              <w:right w:val="single" w:sz="4" w:space="0" w:color="000000"/>
             </w:tcBorders>
           </w:tcPr>
           <w:p>
@@ -1315,6 +1325,34 @@
                 <w:b/>
                 <w:sz w:val="20"/>
               </w:rPr>
+              <w:t>R</w:t>
+            </w:r>
+            <w:r>
+              <w:rPr>
+                <w:rFonts w:cs="Arial" w:ascii="Arial" w:hAnsi="Arial"/>
+                <w:b/>
+                <w:sz w:val="20"/>
+              </w:rPr>
+              <w:t xml:space="preserve">épondre à un besoin de stockage collaboratif sécurisé. La solution devait permettre le partage de fichiers entre collaborateurs sans dépendre d'un serveur physique sur site, tout en garantissant la confidentialité des données. </w:t>
+            </w:r>
+          </w:p>
+          <w:p>
+            <w:pPr>
+              <w:pStyle w:val="Normal"/>
+              <w:snapToGrid w:val="false"/>
+              <w:jc w:val="both"/>
+              <w:rPr>
+                <w:rFonts w:ascii="Arial" w:hAnsi="Arial" w:cs="Arial"/>
+                <w:b/>
+                <w:sz w:val="20"/>
+              </w:rPr>
+            </w:pPr>
+            <w:r>
+              <w:rPr>
+                <w:rFonts w:cs="Arial" w:ascii="Arial" w:hAnsi="Arial"/>
+                <w:b/>
+                <w:sz w:val="20"/>
+              </w:rPr>
               <w:t>Nous devons accéder à une interface web avec une IPv4 Publique.</w:t>
             </w:r>
           </w:p>
@@ -1336,21 +1374,6 @@
                 <w:sz w:val="20"/>
               </w:rPr>
               <w:t>Seul l’instance Web doit être accessible de l’extérieur.</w:t>
-            </w:r>
-          </w:p>
-          <w:p>
-            <w:pPr>
-              <w:pStyle w:val="Normal"/>
-              <w:rPr>
-                <w:rFonts w:ascii="Arial" w:hAnsi="Arial" w:cs="Arial"/>
-                <w:sz w:val="20"/>
-              </w:rPr>
-            </w:pPr>
-            <w:r>
-              <w:rPr>
-                <w:rFonts w:cs="Arial" w:ascii="Arial" w:hAnsi="Arial"/>
-                <w:sz w:val="20"/>
-              </w:rPr>
             </w:r>
           </w:p>
           <w:p>
@@ -1381,9 +1404,9 @@
             <w:gridSpan w:val="4"/>
             <w:tcBorders>
               <w:top w:val="single" w:sz="4" w:space="0" w:color="000000"/>
-              <w:start w:val="single" w:sz="4" w:space="0" w:color="000000"/>
+              <w:left w:val="single" w:sz="4" w:space="0" w:color="000000"/>
               <w:bottom w:val="single" w:sz="4" w:space="0" w:color="000000"/>
-              <w:end w:val="single" w:sz="4" w:space="0" w:color="000000"/>
+              <w:right w:val="single" w:sz="4" w:space="0" w:color="000000"/>
             </w:tcBorders>
           </w:tcPr>
           <w:p>
@@ -1658,9 +1681,9 @@
             <w:gridSpan w:val="4"/>
             <w:tcBorders>
               <w:top w:val="single" w:sz="4" w:space="0" w:color="000000"/>
-              <w:start w:val="single" w:sz="4" w:space="0" w:color="000000"/>
+              <w:left w:val="single" w:sz="4" w:space="0" w:color="000000"/>
               <w:bottom w:val="single" w:sz="4" w:space="0" w:color="000000"/>
-              <w:end w:val="single" w:sz="4" w:space="0" w:color="000000"/>
+              <w:right w:val="single" w:sz="4" w:space="0" w:color="000000"/>
             </w:tcBorders>
           </w:tcPr>
           <w:p>
@@ -1737,7 +1760,7 @@
                 <w:sz w:val="20"/>
               </w:rPr>
               <w:drawing>
-                <wp:anchor distT="0" distB="0" distL="0" distR="0" simplePos="0" relativeHeight="3" behindDoc="0" locked="0" layoutInCell="0" allowOverlap="1">
+                <wp:anchor behindDoc="0" distT="0" distB="0" distL="0" distR="0" simplePos="0" locked="0" layoutInCell="1" allowOverlap="1" relativeHeight="3">
                   <wp:simplePos x="0" y="0"/>
                   <wp:positionH relativeFrom="column">
                     <wp:posOffset>5480685</wp:posOffset>
@@ -1748,7 +1771,7 @@
                   <wp:extent cx="611505" cy="611505"/>
                   <wp:effectExtent l="0" t="0" r="0" b="0"/>
                   <wp:wrapSquare wrapText="largest"/>
-                  <wp:docPr id="1" name="Image1"/>
+                  <wp:docPr id="1" name="Image1" descr=""/>
                   <wp:cNvGraphicFramePr>
                     <a:graphicFrameLocks xmlns:a="http://schemas.openxmlformats.org/drawingml/2006/main" noChangeAspect="1"/>
                   </wp:cNvGraphicFramePr>
@@ -1756,7 +1779,7 @@
                     <a:graphicData uri="http://schemas.openxmlformats.org/drawingml/2006/picture">
                       <pic:pic xmlns:pic="http://schemas.openxmlformats.org/drawingml/2006/picture">
                         <pic:nvPicPr>
-                          <pic:cNvPr id="1" name="Image1"/>
+                          <pic:cNvPr id="1" name="Image1" descr=""/>
                           <pic:cNvPicPr>
                             <a:picLocks noChangeAspect="1" noChangeArrowheads="1"/>
                           </pic:cNvPicPr>
@@ -1775,7 +1798,6 @@
                           <a:prstGeom prst="rect">
                             <a:avLst/>
                           </a:prstGeom>
-                          <a:noFill/>
                         </pic:spPr>
                       </pic:pic>
                     </a:graphicData>
@@ -1892,14 +1914,14 @@
     <w:tbl>
       <w:tblPr>
         <w:tblW w:w="9923" w:type="dxa"/>
-        <w:jc w:val="start"/>
+        <w:jc w:val="left"/>
         <w:tblInd w:w="-147" w:type="dxa"/>
         <w:tblLayout w:type="fixed"/>
         <w:tblCellMar>
           <w:top w:w="0" w:type="dxa"/>
-          <w:start w:w="108" w:type="dxa"/>
+          <w:left w:w="108" w:type="dxa"/>
           <w:bottom w:w="0" w:type="dxa"/>
-          <w:end w:w="108" w:type="dxa"/>
+          <w:right w:w="108" w:type="dxa"/>
         </w:tblCellMar>
         <w:tblLook w:val="04a0" w:noHBand="0" w:noVBand="1" w:firstColumn="1" w:lastRow="0" w:lastColumn="0" w:firstRow="1"/>
       </w:tblPr>
@@ -1913,9 +1935,9 @@
             <w:tcW w:w="9923" w:type="dxa"/>
             <w:tcBorders>
               <w:top w:val="single" w:sz="4" w:space="0" w:color="000000"/>
-              <w:start w:val="single" w:sz="4" w:space="0" w:color="000000"/>
+              <w:left w:val="single" w:sz="4" w:space="0" w:color="000000"/>
               <w:bottom w:val="single" w:sz="4" w:space="0" w:color="000000"/>
-              <w:end w:val="single" w:sz="4" w:space="0" w:color="000000"/>
+              <w:right w:val="single" w:sz="4" w:space="0" w:color="000000"/>
             </w:tcBorders>
           </w:tcPr>
           <w:p>
@@ -1976,7 +1998,7 @@
                 <w:numId w:val="0"/>
               </w:numPr>
               <w:spacing w:before="120" w:after="120"/>
-              <w:ind w:hanging="0" w:start="0"/>
+              <w:ind w:hanging="0" w:left="0"/>
               <w:jc w:val="center"/>
               <w:outlineLvl w:val="0"/>
               <w:rPr>
@@ -2086,7 +2108,7 @@
           <w:ilvl w:val="0"/>
           <w:numId w:val="0"/>
         </w:numPr>
-        <w:ind w:hanging="0" w:start="0"/>
+        <w:ind w:hanging="0" w:left="0"/>
         <w:outlineLvl w:val="0"/>
         <w:rPr>
           <w:rFonts w:ascii="Arial" w:hAnsi="Arial" w:cs="Arial"/>
@@ -2109,14 +2131,14 @@
     <w:tbl>
       <w:tblPr>
         <w:tblW w:w="9975" w:type="dxa"/>
-        <w:jc w:val="start"/>
+        <w:jc w:val="left"/>
         <w:tblInd w:w="-147" w:type="dxa"/>
         <w:tblLayout w:type="fixed"/>
         <w:tblCellMar>
           <w:top w:w="0" w:type="dxa"/>
-          <w:start w:w="5" w:type="dxa"/>
+          <w:left w:w="5" w:type="dxa"/>
           <w:bottom w:w="0" w:type="dxa"/>
-          <w:end w:w="5" w:type="dxa"/>
+          <w:right w:w="5" w:type="dxa"/>
         </w:tblCellMar>
         <w:tblLook w:val="0000" w:noHBand="0" w:noVBand="0" w:firstColumn="0" w:lastRow="0" w:lastColumn="0" w:firstRow="0"/>
       </w:tblPr>
@@ -2133,9 +2155,9 @@
             <w:tcW w:w="9975" w:type="dxa"/>
             <w:tcBorders>
               <w:top w:val="single" w:sz="4" w:space="0" w:color="000000"/>
-              <w:start w:val="single" w:sz="4" w:space="0" w:color="000000"/>
+              <w:left w:val="single" w:sz="4" w:space="0" w:color="000000"/>
               <w:bottom w:val="single" w:sz="4" w:space="0" w:color="000000"/>
-              <w:end w:val="single" w:sz="4" w:space="0" w:color="000000"/>
+              <w:right w:val="single" w:sz="4" w:space="0" w:color="000000"/>
             </w:tcBorders>
             <w:vAlign w:val="center"/>
           </w:tcPr>
@@ -2180,6 +2202,7 @@
                 <w:sz w:val="20"/>
                 <w:szCs w:val="20"/>
               </w:rPr>
+              <w:t>Création d’un Réseau Virtuel (VPC) et de Sous-Réseaux Virtuels</w:t>
             </w:r>
           </w:p>
           <w:p>
@@ -2201,7 +2224,7 @@
                 <w:sz w:val="20"/>
                 <w:szCs w:val="20"/>
               </w:rPr>
-              <w:t>Création d’un Réseau Virtuel (VPC) et de Sous-Réseaux Virtuels</w:t>
+              <w:t>Création de rôle IAM pour authentifier les instances entre elles.</w:t>
             </w:r>
           </w:p>
           <w:p>
@@ -2223,7 +2246,7 @@
                 <w:sz w:val="20"/>
                 <w:szCs w:val="20"/>
               </w:rPr>
-              <w:t>Création de rôle IAM pour authentifier les instances entre elles.</w:t>
+              <w:t>Création d’ACL (Security Group) pour appliquer le principe de moindre privilège entre les instances et services.</w:t>
             </w:r>
           </w:p>
           <w:p>
@@ -2245,7 +2268,7 @@
                 <w:sz w:val="20"/>
                 <w:szCs w:val="20"/>
               </w:rPr>
-              <w:t>Création d’ACL (Security Group) pour appliquer le principe de moindre privilège entre les instances et services.</w:t>
+              <w:t>Création d’instances EC2 (Machines Virtuelles classiques)</w:t>
             </w:r>
           </w:p>
           <w:p>
@@ -2267,7 +2290,7 @@
                 <w:sz w:val="20"/>
                 <w:szCs w:val="20"/>
               </w:rPr>
-              <w:t>Création d’instances EC2 (Machines Virtuelles classiques)</w:t>
+              <w:t>Création de base de donnée RDS (Instance préconfigurée AWS avec MySQL)</w:t>
             </w:r>
           </w:p>
           <w:p>
@@ -2289,7 +2312,7 @@
                 <w:sz w:val="20"/>
                 <w:szCs w:val="20"/>
               </w:rPr>
-              <w:t>Création de base de donnée RDS (Instance préconfigurée AWS avec MySQL)</w:t>
+              <w:t>Création d’un pool de donnée S3 Bucket (Espace de Stockage)</w:t>
             </w:r>
           </w:p>
           <w:p>
@@ -2311,7 +2334,7 @@
                 <w:sz w:val="20"/>
                 <w:szCs w:val="20"/>
               </w:rPr>
-              <w:t>Création d’un pool de donnée S3 Bucket (Espace de Stockage)</w:t>
+              <w:t>Installation du service Nextcloud sur un OS Linux (AWS linux soit RedHat personnalisé)</w:t>
             </w:r>
           </w:p>
           <w:p>
@@ -2333,7 +2356,7 @@
                 <w:sz w:val="20"/>
                 <w:szCs w:val="20"/>
               </w:rPr>
-              <w:t>Installation du service Nextcloud sur un OS Linux (AWS linux soit RedHat personnalisé)</w:t>
+              <w:t>Scripting d’installation pour efficacité et reproductibilité.</w:t>
             </w:r>
           </w:p>
           <w:p>
@@ -2355,30 +2378,8 @@
                 <w:sz w:val="20"/>
                 <w:szCs w:val="20"/>
               </w:rPr>
-              <w:t>Scripting d’installation pour efficacité et reproductibilité.</w:t>
-            </w:r>
-          </w:p>
-          <w:p>
-            <w:pPr>
-              <w:pStyle w:val="Normal"/>
-              <w:snapToGrid w:val="false"/>
-              <w:spacing w:lineRule="auto" w:line="276"/>
-              <w:rPr>
-                <w:rFonts w:ascii="Arial" w:hAnsi="Arial"/>
-                <w:bCs/>
-                <w:sz w:val="20"/>
-                <w:szCs w:val="20"/>
-              </w:rPr>
-            </w:pPr>
-            <w:r>
-              <w:rPr>
-                <w:rFonts w:ascii="Arial" w:hAnsi="Arial"/>
-                <w:bCs/>
-                <w:sz w:val="20"/>
-                <w:szCs w:val="20"/>
-              </w:rPr>
               <w:drawing>
-                <wp:anchor distT="0" distB="0" distL="0" distR="0" simplePos="0" relativeHeight="2" behindDoc="0" locked="0" layoutInCell="1" allowOverlap="1">
+                <wp:anchor behindDoc="0" distT="0" distB="0" distL="0" distR="0" simplePos="0" locked="0" layoutInCell="1" allowOverlap="1" relativeHeight="2">
                   <wp:simplePos x="0" y="0"/>
                   <wp:positionH relativeFrom="column">
                     <wp:posOffset>480695</wp:posOffset>
@@ -2389,7 +2390,7 @@
                   <wp:extent cx="5349875" cy="3566160"/>
                   <wp:effectExtent l="0" t="0" r="0" b="0"/>
                   <wp:wrapSquare wrapText="largest"/>
-                  <wp:docPr id="2" name="Image2"/>
+                  <wp:docPr id="2" name="Image2" descr=""/>
                   <wp:cNvGraphicFramePr>
                     <a:graphicFrameLocks xmlns:a="http://schemas.openxmlformats.org/drawingml/2006/main" noChangeAspect="1"/>
                   </wp:cNvGraphicFramePr>
@@ -2397,7 +2398,7 @@
                     <a:graphicData uri="http://schemas.openxmlformats.org/drawingml/2006/picture">
                       <pic:pic xmlns:pic="http://schemas.openxmlformats.org/drawingml/2006/picture">
                         <pic:nvPicPr>
-                          <pic:cNvPr id="2" name="Image2"/>
+                          <pic:cNvPr id="2" name="Image2" descr=""/>
                           <pic:cNvPicPr>
                             <a:picLocks noChangeAspect="1" noChangeArrowheads="1"/>
                           </pic:cNvPicPr>
@@ -2416,7 +2417,6 @@
                           <a:prstGeom prst="rect">
                             <a:avLst/>
                           </a:prstGeom>
-                          <a:noFill/>
                         </pic:spPr>
                       </pic:pic>
                     </a:graphicData>
@@ -3055,9 +3055,14 @@
 </file>
 
 <file path=word/footnotes.xml><?xml version="1.0" encoding="utf-8"?>
-<w:footnotes xmlns:o="urn:schemas-microsoft-com:office:office" xmlns:r="http://schemas.openxmlformats.org/officeDocument/2006/relationships" xmlns:v="urn:schemas-microsoft-com:vml" xmlns:w="http://schemas.openxmlformats.org/wordprocessingml/2006/main" xmlns:w10="urn:schemas-microsoft-com:office:word" xmlns:wp="http://schemas.openxmlformats.org/drawingml/2006/wordprocessingDrawing" xmlns:pic="http://schemas.openxmlformats.org/drawingml/2006/picture" xmlns:wps="http://schemas.microsoft.com/office/word/2010/wordprocessingShape" xmlns:wpg="http://schemas.microsoft.com/office/word/2010/wordprocessingGroup" xmlns:mc="http://schemas.openxmlformats.org/markup-compatibility/2006" xmlns:wp14="http://schemas.microsoft.com/office/word/2010/wordprocessingDrawing" xmlns:w14="http://schemas.microsoft.com/office/word/2010/wordml" xmlns:w15="http://schemas.microsoft.com/office/word/2012/wordml" mc:Ignorable="w14 wp14 w15">
+<w:footnotes xmlns:o="urn:schemas-microsoft-com:office:office" xmlns:r="http://schemas.openxmlformats.org/officeDocument/2006/relationships" xmlns:v="urn:schemas-microsoft-com:vml" xmlns:w="http://schemas.openxmlformats.org/wordprocessingml/2006/main" xmlns:w10="urn:schemas-microsoft-com:office:word" xmlns:wp="http://schemas.openxmlformats.org/drawingml/2006/wordprocessingDrawing" xmlns:wps="http://schemas.microsoft.com/office/word/2010/wordprocessingShape" xmlns:wpg="http://schemas.microsoft.com/office/word/2010/wordprocessingGroup" xmlns:mc="http://schemas.openxmlformats.org/markup-compatibility/2006" xmlns:wp14="http://schemas.microsoft.com/office/word/2010/wordprocessingDrawing" xmlns:w14="http://schemas.microsoft.com/office/word/2010/wordml" xmlns:w15="http://schemas.microsoft.com/office/word/2012/wordml" mc:Ignorable="w14 wp14 w15">
   <w:footnote w:id="0" w:type="separator">
     <w:p>
+      <w:pPr>
+        <w:rPr>
+          <w:sz w:val="12"/>
+        </w:rPr>
+      </w:pPr>
       <w:r>
         <w:separator/>
       </w:r>
@@ -3065,6 +3070,11 @@
   </w:footnote>
   <w:footnote w:id="1" w:type="continuationSeparator">
     <w:p>
+      <w:pPr>
+        <w:rPr>
+          <w:sz w:val="12"/>
+        </w:rPr>
+      </w:pPr>
       <w:r>
         <w:continuationSeparator/>
       </w:r>
@@ -3083,13 +3093,13 @@
       </w:pPr>
       <w:r>
         <w:rPr>
-          <w:rStyle w:val="FootnoteCharacters"/>
+          <w:rStyle w:val="Caractresdenotedebasdepage"/>
         </w:rPr>
         <w:footnoteRef/>
       </w:r>
       <w:r>
         <w:rPr>
-          <w:rStyle w:val="FootnoteCharactersuser"/>
+          <w:rStyle w:val="FootnoteCharacters"/>
         </w:rPr>
         <w:t xml:space="preserve"> </w:t>
       </w:r>
@@ -3133,7 +3143,7 @@
       </w:pPr>
       <w:r>
         <w:rPr>
-          <w:rStyle w:val="FootnoteCharacters"/>
+          <w:rStyle w:val="Caractresdenotedebasdepage"/>
         </w:rPr>
         <w:footnoteRef/>
       </w:r>
@@ -3177,7 +3187,7 @@
       </w:pPr>
       <w:r>
         <w:rPr>
-          <w:rStyle w:val="FootnoteCharacters"/>
+          <w:rStyle w:val="Caractresdenotedebasdepage"/>
         </w:rPr>
         <w:footnoteRef/>
       </w:r>
@@ -3231,7 +3241,7 @@
       </w:pPr>
       <w:r>
         <w:rPr>
-          <w:rStyle w:val="FootnoteCharacters"/>
+          <w:rStyle w:val="Caractresdenotedebasdepage"/>
         </w:rPr>
         <w:footnoteRef/>
       </w:r>
@@ -3262,12 +3272,12 @@
       <w:start w:val="1"/>
       <w:numFmt w:val="bullet"/>
       <w:lvlText w:val=""/>
-      <w:lvlJc w:val="start"/>
+      <w:lvlJc w:val="left"/>
       <w:pPr>
         <w:tabs>
           <w:tab w:val="num" w:pos="720"/>
         </w:tabs>
-        <w:ind w:start="720" w:hanging="360"/>
+        <w:ind w:left="720" w:hanging="360"/>
       </w:pPr>
       <w:rPr>
         <w:rFonts w:ascii="Symbol" w:hAnsi="Symbol" w:cs="Symbol" w:hint="default"/>
@@ -3277,12 +3287,12 @@
       <w:start w:val="1"/>
       <w:numFmt w:val="bullet"/>
       <w:lvlText w:val="◦"/>
-      <w:lvlJc w:val="start"/>
+      <w:lvlJc w:val="left"/>
       <w:pPr>
         <w:tabs>
           <w:tab w:val="num" w:pos="1080"/>
         </w:tabs>
-        <w:ind w:start="1080" w:hanging="360"/>
+        <w:ind w:left="1080" w:hanging="360"/>
       </w:pPr>
       <w:rPr>
         <w:rFonts w:ascii="OpenSymbol" w:hAnsi="OpenSymbol" w:cs="OpenSymbol" w:hint="default"/>
@@ -3292,12 +3302,12 @@
       <w:start w:val="1"/>
       <w:numFmt w:val="bullet"/>
       <w:lvlText w:val="▪"/>
-      <w:lvlJc w:val="start"/>
+      <w:lvlJc w:val="left"/>
       <w:pPr>
         <w:tabs>
           <w:tab w:val="num" w:pos="1440"/>
         </w:tabs>
-        <w:ind w:start="1440" w:hanging="360"/>
+        <w:ind w:left="1440" w:hanging="360"/>
       </w:pPr>
       <w:rPr>
         <w:rFonts w:ascii="OpenSymbol" w:hAnsi="OpenSymbol" w:cs="OpenSymbol" w:hint="default"/>
@@ -3307,12 +3317,12 @@
       <w:start w:val="1"/>
       <w:numFmt w:val="bullet"/>
       <w:lvlText w:val=""/>
-      <w:lvlJc w:val="start"/>
+      <w:lvlJc w:val="left"/>
       <w:pPr>
         <w:tabs>
           <w:tab w:val="num" w:pos="1800"/>
         </w:tabs>
-        <w:ind w:start="1800" w:hanging="360"/>
+        <w:ind w:left="1800" w:hanging="360"/>
       </w:pPr>
       <w:rPr>
         <w:rFonts w:ascii="Symbol" w:hAnsi="Symbol" w:cs="Symbol" w:hint="default"/>
@@ -3322,12 +3332,12 @@
       <w:start w:val="1"/>
       <w:numFmt w:val="bullet"/>
       <w:lvlText w:val="◦"/>
-      <w:lvlJc w:val="start"/>
+      <w:lvlJc w:val="left"/>
       <w:pPr>
         <w:tabs>
           <w:tab w:val="num" w:pos="2160"/>
         </w:tabs>
-        <w:ind w:start="2160" w:hanging="360"/>
+        <w:ind w:left="2160" w:hanging="360"/>
       </w:pPr>
       <w:rPr>
         <w:rFonts w:ascii="OpenSymbol" w:hAnsi="OpenSymbol" w:cs="OpenSymbol" w:hint="default"/>
@@ -3337,12 +3347,12 @@
       <w:start w:val="1"/>
       <w:numFmt w:val="bullet"/>
       <w:lvlText w:val="▪"/>
-      <w:lvlJc w:val="start"/>
+      <w:lvlJc w:val="left"/>
       <w:pPr>
         <w:tabs>
           <w:tab w:val="num" w:pos="2520"/>
         </w:tabs>
-        <w:ind w:start="2520" w:hanging="360"/>
+        <w:ind w:left="2520" w:hanging="360"/>
       </w:pPr>
       <w:rPr>
         <w:rFonts w:ascii="OpenSymbol" w:hAnsi="OpenSymbol" w:cs="OpenSymbol" w:hint="default"/>
@@ -3352,12 +3362,12 @@
       <w:start w:val="1"/>
       <w:numFmt w:val="bullet"/>
       <w:lvlText w:val=""/>
-      <w:lvlJc w:val="start"/>
+      <w:lvlJc w:val="left"/>
       <w:pPr>
         <w:tabs>
           <w:tab w:val="num" w:pos="2880"/>
         </w:tabs>
-        <w:ind w:start="2880" w:hanging="360"/>
+        <w:ind w:left="2880" w:hanging="360"/>
       </w:pPr>
       <w:rPr>
         <w:rFonts w:ascii="Symbol" w:hAnsi="Symbol" w:cs="Symbol" w:hint="default"/>
@@ -3367,12 +3377,12 @@
       <w:start w:val="1"/>
       <w:numFmt w:val="bullet"/>
       <w:lvlText w:val="◦"/>
-      <w:lvlJc w:val="start"/>
+      <w:lvlJc w:val="left"/>
       <w:pPr>
         <w:tabs>
           <w:tab w:val="num" w:pos="3240"/>
         </w:tabs>
-        <w:ind w:start="3240" w:hanging="360"/>
+        <w:ind w:left="3240" w:hanging="360"/>
       </w:pPr>
       <w:rPr>
         <w:rFonts w:ascii="OpenSymbol" w:hAnsi="OpenSymbol" w:cs="OpenSymbol" w:hint="default"/>
@@ -3382,12 +3392,12 @@
       <w:start w:val="1"/>
       <w:numFmt w:val="bullet"/>
       <w:lvlText w:val="▪"/>
-      <w:lvlJc w:val="start"/>
+      <w:lvlJc w:val="left"/>
       <w:pPr>
         <w:tabs>
           <w:tab w:val="num" w:pos="3600"/>
         </w:tabs>
-        <w:ind w:start="3600" w:hanging="360"/>
+        <w:ind w:left="3600" w:hanging="360"/>
       </w:pPr>
       <w:rPr>
         <w:rFonts w:ascii="OpenSymbol" w:hAnsi="OpenSymbol" w:cs="OpenSymbol" w:hint="default"/>
@@ -3400,12 +3410,12 @@
       <w:numFmt w:val="none"/>
       <w:suff w:val="nothing"/>
       <w:lvlText w:val=""/>
-      <w:lvlJc w:val="start"/>
+      <w:lvlJc w:val="left"/>
       <w:pPr>
         <w:tabs>
           <w:tab w:val="num" w:pos="0"/>
         </w:tabs>
-        <w:ind w:start="0" w:hanging="0"/>
+        <w:ind w:left="0" w:hanging="0"/>
       </w:pPr>
     </w:lvl>
     <w:lvl w:ilvl="1">
@@ -3413,12 +3423,12 @@
       <w:numFmt w:val="none"/>
       <w:suff w:val="nothing"/>
       <w:lvlText w:val=""/>
-      <w:lvlJc w:val="start"/>
+      <w:lvlJc w:val="left"/>
       <w:pPr>
         <w:tabs>
           <w:tab w:val="num" w:pos="0"/>
         </w:tabs>
-        <w:ind w:start="0" w:hanging="0"/>
+        <w:ind w:left="0" w:hanging="0"/>
       </w:pPr>
     </w:lvl>
     <w:lvl w:ilvl="2">
@@ -3426,12 +3436,12 @@
       <w:numFmt w:val="none"/>
       <w:suff w:val="nothing"/>
       <w:lvlText w:val=""/>
-      <w:lvlJc w:val="start"/>
+      <w:lvlJc w:val="left"/>
       <w:pPr>
         <w:tabs>
           <w:tab w:val="num" w:pos="0"/>
         </w:tabs>
-        <w:ind w:start="0" w:hanging="0"/>
+        <w:ind w:left="0" w:hanging="0"/>
       </w:pPr>
     </w:lvl>
     <w:lvl w:ilvl="3">
@@ -3439,12 +3449,12 @@
       <w:numFmt w:val="none"/>
       <w:suff w:val="nothing"/>
       <w:lvlText w:val=""/>
-      <w:lvlJc w:val="start"/>
+      <w:lvlJc w:val="left"/>
       <w:pPr>
         <w:tabs>
           <w:tab w:val="num" w:pos="0"/>
         </w:tabs>
-        <w:ind w:start="0" w:hanging="0"/>
+        <w:ind w:left="0" w:hanging="0"/>
       </w:pPr>
     </w:lvl>
     <w:lvl w:ilvl="4">
@@ -3452,12 +3462,12 @@
       <w:numFmt w:val="none"/>
       <w:suff w:val="nothing"/>
       <w:lvlText w:val=""/>
-      <w:lvlJc w:val="start"/>
+      <w:lvlJc w:val="left"/>
       <w:pPr>
         <w:tabs>
           <w:tab w:val="num" w:pos="0"/>
         </w:tabs>
-        <w:ind w:start="0" w:hanging="0"/>
+        <w:ind w:left="0" w:hanging="0"/>
       </w:pPr>
     </w:lvl>
     <w:lvl w:ilvl="5">
@@ -3465,12 +3475,12 @@
       <w:numFmt w:val="none"/>
       <w:suff w:val="nothing"/>
       <w:lvlText w:val=""/>
-      <w:lvlJc w:val="start"/>
+      <w:lvlJc w:val="left"/>
       <w:pPr>
         <w:tabs>
           <w:tab w:val="num" w:pos="0"/>
         </w:tabs>
-        <w:ind w:start="0" w:hanging="0"/>
+        <w:ind w:left="0" w:hanging="0"/>
       </w:pPr>
     </w:lvl>
     <w:lvl w:ilvl="6">
@@ -3478,12 +3488,12 @@
       <w:numFmt w:val="none"/>
       <w:suff w:val="nothing"/>
       <w:lvlText w:val=""/>
-      <w:lvlJc w:val="start"/>
+      <w:lvlJc w:val="left"/>
       <w:pPr>
         <w:tabs>
           <w:tab w:val="num" w:pos="0"/>
         </w:tabs>
-        <w:ind w:start="0" w:hanging="0"/>
+        <w:ind w:left="0" w:hanging="0"/>
       </w:pPr>
     </w:lvl>
     <w:lvl w:ilvl="7">
@@ -3491,12 +3501,12 @@
       <w:numFmt w:val="none"/>
       <w:suff w:val="nothing"/>
       <w:lvlText w:val=""/>
-      <w:lvlJc w:val="start"/>
+      <w:lvlJc w:val="left"/>
       <w:pPr>
         <w:tabs>
           <w:tab w:val="num" w:pos="0"/>
         </w:tabs>
-        <w:ind w:start="0" w:hanging="0"/>
+        <w:ind w:left="0" w:hanging="0"/>
       </w:pPr>
     </w:lvl>
     <w:lvl w:ilvl="8">
@@ -3504,12 +3514,12 @@
       <w:numFmt w:val="none"/>
       <w:suff w:val="nothing"/>
       <w:lvlText w:val=""/>
-      <w:lvlJc w:val="start"/>
+      <w:lvlJc w:val="left"/>
       <w:pPr>
         <w:tabs>
           <w:tab w:val="num" w:pos="0"/>
         </w:tabs>
-        <w:ind w:start="0" w:hanging="0"/>
+        <w:ind w:left="0" w:hanging="0"/>
       </w:pPr>
     </w:lvl>
   </w:abstractNum>
@@ -3926,7 +3936,7 @@
       <w:suppressAutoHyphens w:val="true"/>
       <w:bidi w:val="0"/>
       <w:spacing w:before="0" w:after="0"/>
-      <w:jc w:val="start"/>
+      <w:jc w:val="left"/>
     </w:pPr>
     <w:rPr>
       <w:rFonts w:ascii="Times" w:hAnsi="Times" w:eastAsia="Times" w:cs="Times"/>
@@ -3938,7 +3948,7 @@
     </w:rPr>
   </w:style>
   <w:style w:type="paragraph" w:styleId="Heading2">
-    <w:name w:val="heading 2"/>
+    <w:name w:val="Heading 2"/>
     <w:basedOn w:val="Normal"/>
     <w:next w:val="Normal"/>
     <w:link w:val="Titre2Car"/>
@@ -3961,7 +3971,7 @@
     </w:rPr>
   </w:style>
   <w:style w:type="paragraph" w:styleId="Heading3">
-    <w:name w:val="heading 3"/>
+    <w:name w:val="Heading 3"/>
     <w:basedOn w:val="Normal"/>
     <w:next w:val="Normal"/>
     <w:link w:val="Titre3Car"/>
@@ -3982,7 +3992,7 @@
     </w:rPr>
   </w:style>
   <w:style w:type="paragraph" w:styleId="Heading9">
-    <w:name w:val="heading 9"/>
+    <w:name w:val="Heading 9"/>
     <w:basedOn w:val="Normal"/>
     <w:next w:val="Normal"/>
     <w:link w:val="Titre9Car"/>
@@ -4009,7 +4019,6 @@
   <w:style w:type="character" w:styleId="Titre9Car" w:customStyle="1">
     <w:name w:val="Titre 9 Car"/>
     <w:basedOn w:val="DefaultParagraphFont"/>
-    <w:link w:val="Heading9"/>
     <w:qFormat/>
     <w:rsid w:val="00226081"/>
     <w:rPr>
@@ -4022,7 +4031,6 @@
   <w:style w:type="character" w:styleId="NotedebasdepageCar" w:customStyle="1">
     <w:name w:val="Note de bas de page Car"/>
     <w:basedOn w:val="DefaultParagraphFont"/>
-    <w:link w:val="FootnoteText"/>
     <w:semiHidden/>
     <w:qFormat/>
     <w:rsid w:val="00226081"/>
@@ -4033,15 +4041,6 @@
       <w:lang w:eastAsia="ar-SA"/>
     </w:rPr>
   </w:style>
-  <w:style w:type="character" w:styleId="FootnoteCharactersuser">
-    <w:name w:val="Footnote Characters (user)"/>
-    <w:semiHidden/>
-    <w:qFormat/>
-    <w:rsid w:val="00226081"/>
-    <w:rPr>
-      <w:vertAlign w:val="superscript"/>
-    </w:rPr>
-  </w:style>
   <w:style w:type="character" w:styleId="FootnoteCharacters">
     <w:name w:val="Footnote Characters"/>
     <w:qFormat/>
@@ -4049,8 +4048,15 @@
       <w:vertAlign w:val="superscript"/>
     </w:rPr>
   </w:style>
+  <w:style w:type="character" w:styleId="Caractresdenotedebasdepage">
+    <w:name w:val="Caractères de note de bas de page"/>
+    <w:qFormat/>
+    <w:rPr>
+      <w:vertAlign w:val="superscript"/>
+    </w:rPr>
+  </w:style>
   <w:style w:type="character" w:styleId="FootnoteReference">
-    <w:name w:val="footnote reference"/>
+    <w:name w:val="Footnote Reference"/>
     <w:rPr>
       <w:vertAlign w:val="superscript"/>
     </w:rPr>
@@ -4058,7 +4064,6 @@
   <w:style w:type="character" w:styleId="Titre2Car" w:customStyle="1">
     <w:name w:val="Titre 2 Car"/>
     <w:basedOn w:val="DefaultParagraphFont"/>
-    <w:link w:val="Heading2"/>
     <w:uiPriority w:val="9"/>
     <w:semiHidden/>
     <w:qFormat/>
@@ -4074,7 +4079,6 @@
   <w:style w:type="character" w:styleId="Titre3Car" w:customStyle="1">
     <w:name w:val="Titre 3 Car"/>
     <w:basedOn w:val="DefaultParagraphFont"/>
-    <w:link w:val="Heading3"/>
     <w:uiPriority w:val="9"/>
     <w:semiHidden/>
     <w:qFormat/>
@@ -4100,7 +4104,7 @@
       <w:lang w:eastAsia="ar-SA"/>
     </w:rPr>
   </w:style>
-  <w:style w:type="character" w:styleId="CommentReference">
+  <w:style w:type="character" w:styleId="annotationreference">
     <w:name w:val="annotation reference"/>
     <w:basedOn w:val="DefaultParagraphFont"/>
     <w:uiPriority w:val="99"/>
@@ -4116,7 +4120,6 @@
   <w:style w:type="character" w:styleId="CommentaireCar" w:customStyle="1">
     <w:name w:val="Commentaire Car"/>
     <w:basedOn w:val="DefaultParagraphFont"/>
-    <w:link w:val="CommentText"/>
     <w:uiPriority w:val="99"/>
     <w:semiHidden/>
     <w:qFormat/>
@@ -4145,8 +4148,8 @@
       <w:lang w:eastAsia="ar-SA"/>
     </w:rPr>
   </w:style>
-  <w:style w:type="character" w:styleId="Bulletsuser">
-    <w:name w:val="Bullets (user)"/>
+  <w:style w:type="character" w:styleId="Bullets">
+    <w:name w:val="Bullets"/>
     <w:qFormat/>
     <w:rPr>
       <w:rFonts w:ascii="OpenSymbol" w:hAnsi="OpenSymbol" w:eastAsia="OpenSymbol" w:cs="OpenSymbol"/>
@@ -4155,20 +4158,20 @@
   <w:style w:type="character" w:styleId="EndnoteCharacters">
     <w:name w:val="Endnote Characters"/>
     <w:qFormat/>
+    <w:rPr/>
+  </w:style>
+  <w:style w:type="character" w:styleId="Caractresdenotedefin">
+    <w:name w:val="Caractères de note de fin"/>
+    <w:qFormat/>
     <w:rPr>
       <w:vertAlign w:val="superscript"/>
     </w:rPr>
   </w:style>
   <w:style w:type="character" w:styleId="EndnoteReference">
-    <w:name w:val="endnote reference"/>
+    <w:name w:val="Endnote Reference"/>
     <w:rPr>
       <w:vertAlign w:val="superscript"/>
     </w:rPr>
-  </w:style>
-  <w:style w:type="character" w:styleId="EndnoteCharactersuser">
-    <w:name w:val="Endnote Characters (user)"/>
-    <w:qFormat/>
-    <w:rPr/>
   </w:style>
   <w:style w:type="character" w:styleId="Hyperlink">
     <w:name w:val="Hyperlink"/>
@@ -4177,8 +4180,8 @@
       <w:u w:val="single"/>
     </w:rPr>
   </w:style>
-  <w:style w:type="paragraph" w:styleId="Heading">
-    <w:name w:val="Heading"/>
+  <w:style w:type="paragraph" w:styleId="Titre">
+    <w:name w:val="Titre"/>
     <w:basedOn w:val="Normal"/>
     <w:next w:val="BodyText"/>
     <w:qFormat/>
@@ -4209,7 +4212,7 @@
     </w:rPr>
   </w:style>
   <w:style w:type="paragraph" w:styleId="Caption">
-    <w:name w:val="caption"/>
+    <w:name w:val="Caption"/>
     <w:basedOn w:val="Normal"/>
     <w:qFormat/>
     <w:pPr>
@@ -4236,7 +4239,7 @@
     </w:rPr>
   </w:style>
   <w:style w:type="paragraph" w:styleId="FootnoteText">
-    <w:name w:val="footnote text"/>
+    <w:name w:val="Footnote Text"/>
     <w:basedOn w:val="Normal"/>
     <w:link w:val="NotedebasdepageCar"/>
     <w:semiHidden/>
@@ -4255,7 +4258,7 @@
     <w:rsid w:val="0082427a"/>
     <w:pPr>
       <w:spacing w:before="0" w:after="0"/>
-      <w:ind w:start="720"/>
+      <w:ind w:left="720"/>
       <w:contextualSpacing/>
     </w:pPr>
     <w:rPr/>
@@ -4289,8 +4292,8 @@
       <w:szCs w:val="18"/>
     </w:rPr>
   </w:style>
-  <w:style w:type="paragraph" w:styleId="CommentText">
-    <w:name w:val="annotation text"/>
+  <w:style w:type="paragraph" w:styleId="AnnotationText">
+    <w:name w:val="Annotation Text"/>
     <w:basedOn w:val="Normal"/>
     <w:link w:val="CommentaireCar"/>
     <w:uiPriority w:val="99"/>
@@ -4305,8 +4308,8 @@
   </w:style>
   <w:style w:type="paragraph" w:styleId="annotationsubject">
     <w:name w:val="annotation subject"/>
-    <w:basedOn w:val="CommentText"/>
-    <w:next w:val="CommentText"/>
+    <w:basedOn w:val="AnnotationText"/>
+    <w:next w:val="AnnotationText"/>
     <w:link w:val="ObjetducommentaireCar"/>
     <w:uiPriority w:val="99"/>
     <w:semiHidden/>
@@ -4330,7 +4333,7 @@
       <w:suppressAutoHyphens w:val="true"/>
       <w:bidi w:val="0"/>
       <w:spacing w:before="0" w:after="0"/>
-      <w:jc w:val="start"/>
+      <w:jc w:val="left"/>
     </w:pPr>
     <w:rPr>
       <w:rFonts w:ascii="Times" w:hAnsi="Times" w:eastAsia="Times" w:cs="Times"/>
@@ -4341,8 +4344,8 @@
       <w:lang w:val="fr-FR" w:eastAsia="ar-SA" w:bidi="ar-SA"/>
     </w:rPr>
   </w:style>
-  <w:style w:type="numbering" w:styleId="NoList" w:default="1">
-    <w:name w:val="No List"/>
+  <w:style w:type="numbering" w:styleId="Pasdeliste" w:default="1">
+    <w:name w:val="Pas de liste"/>
     <w:uiPriority w:val="99"/>
     <w:semiHidden/>
     <w:unhideWhenUsed/>

</xml_diff>